<commit_message>
Added huntress controller, player script, light and heavy attacks animations and vfx script
</commit_message>
<xml_diff>
--- a/ToDoList.docx
+++ b/ToDoList.docx
@@ -392,6 +392,8 @@
         </w:rPr>
         <w:t xml:space="preserve"> (7/10)</w:t>
       </w:r>
+      <w:bookmarkStart w:id="0" w:name="_GoBack"/>
+      <w:bookmarkEnd w:id="0"/>
     </w:p>
     <w:p>
       <w:r>
@@ -409,11 +411,13 @@
           <w:numId w:val="3"/>
         </w:numPr>
         <w:rPr>
-          <w:highlight w:val="yellow"/>
-        </w:rPr>
-      </w:pPr>
-      <w:r>
-        <w:rPr>
+          <w:color w:val="00B050"/>
+          <w:highlight w:val="yellow"/>
+        </w:rPr>
+      </w:pPr>
+      <w:r>
+        <w:rPr>
+          <w:color w:val="00B050"/>
           <w:highlight w:val="yellow"/>
         </w:rPr>
         <w:t xml:space="preserve">Добавить персонажа и анимировать </w:t>
@@ -421,12 +425,14 @@
       <w:proofErr w:type="gramStart"/>
       <w:r>
         <w:rPr>
+          <w:color w:val="00B050"/>
           <w:highlight w:val="yellow"/>
         </w:rPr>
         <w:t>ч</w:t>
       </w:r>
       <w:r>
         <w:rPr>
+          <w:color w:val="00B050"/>
           <w:highlight w:val="yellow"/>
         </w:rPr>
         <w:t>ерез бленд</w:t>
@@ -434,24 +440,28 @@
       <w:proofErr w:type="gramEnd"/>
       <w:r>
         <w:rPr>
+          <w:color w:val="00B050"/>
           <w:highlight w:val="yellow"/>
         </w:rPr>
         <w:t xml:space="preserve"> три </w:t>
       </w:r>
       <w:r>
         <w:rPr>
+          <w:color w:val="00B050"/>
           <w:highlight w:val="yellow"/>
         </w:rPr>
         <w:t>(</w:t>
       </w:r>
       <w:r>
         <w:rPr>
+          <w:color w:val="00B050"/>
           <w:highlight w:val="yellow"/>
         </w:rPr>
         <w:t>4</w:t>
       </w:r>
       <w:r>
         <w:rPr>
+          <w:color w:val="00B050"/>
           <w:highlight w:val="yellow"/>
         </w:rPr>
         <w:t>/10)</w:t>
@@ -465,23 +475,24 @@
           <w:numId w:val="3"/>
         </w:numPr>
         <w:rPr>
-          <w:highlight w:val="yellow"/>
-        </w:rPr>
-      </w:pPr>
-      <w:r>
-        <w:rPr>
+          <w:color w:val="00B050"/>
+          <w:highlight w:val="yellow"/>
+        </w:rPr>
+      </w:pPr>
+      <w:r>
+        <w:rPr>
+          <w:color w:val="00B050"/>
           <w:highlight w:val="yellow"/>
         </w:rPr>
         <w:t>написать простой контроллер</w:t>
       </w:r>
       <w:r>
         <w:rPr>
+          <w:color w:val="00B050"/>
           <w:highlight w:val="yellow"/>
         </w:rPr>
         <w:t xml:space="preserve"> (4/10)</w:t>
       </w:r>
-      <w:bookmarkStart w:id="0" w:name="_GoBack"/>
-      <w:bookmarkEnd w:id="0"/>
     </w:p>
     <w:p>
       <w:pPr>

</xml_diff>

<commit_message>
Fixed attack animations transitions
</commit_message>
<xml_diff>
--- a/ToDoList.docx
+++ b/ToDoList.docx
@@ -392,8 +392,6 @@
         </w:rPr>
         <w:t xml:space="preserve"> (7/10)</w:t>
       </w:r>
-      <w:bookmarkStart w:id="0" w:name="_GoBack"/>
-      <w:bookmarkEnd w:id="0"/>
     </w:p>
     <w:p>
       <w:r>
@@ -491,7 +489,16 @@
           <w:color w:val="00B050"/>
           <w:highlight w:val="yellow"/>
         </w:rPr>
-        <w:t xml:space="preserve"> (4/10)</w:t>
+        <w:t xml:space="preserve"> (4/10</w:t>
+      </w:r>
+      <w:bookmarkStart w:id="0" w:name="_GoBack"/>
+      <w:bookmarkEnd w:id="0"/>
+      <w:r>
+        <w:rPr>
+          <w:color w:val="00B050"/>
+          <w:highlight w:val="yellow"/>
+        </w:rPr>
+        <w:t>)</w:t>
       </w:r>
     </w:p>
     <w:p>
@@ -512,11 +519,13 @@
           <w:numId w:val="3"/>
         </w:numPr>
         <w:rPr>
-          <w:highlight w:val="cyan"/>
-        </w:rPr>
-      </w:pPr>
-      <w:r>
-        <w:rPr>
+          <w:color w:val="538135" w:themeColor="accent6" w:themeShade="BF"/>
+          <w:highlight w:val="cyan"/>
+        </w:rPr>
+      </w:pPr>
+      <w:r>
+        <w:rPr>
+          <w:color w:val="538135" w:themeColor="accent6" w:themeShade="BF"/>
           <w:highlight w:val="cyan"/>
         </w:rPr>
         <w:t>Сделать Спрайт Атлас</w:t>
@@ -582,6 +591,24 @@
           <w:lang w:val="en-US"/>
         </w:rPr>
         <w:t>)</w:t>
+      </w:r>
+    </w:p>
+    <w:p>
+      <w:pPr>
+        <w:pStyle w:val="a3"/>
+        <w:numPr>
+          <w:ilvl w:val="0"/>
+          <w:numId w:val="3"/>
+        </w:numPr>
+        <w:rPr>
+          <w:highlight w:val="cyan"/>
+        </w:rPr>
+      </w:pPr>
+      <w:r>
+        <w:rPr>
+          <w:highlight w:val="cyan"/>
+        </w:rPr>
+        <w:t>сделать контроллер передвижения персонажа</w:t>
       </w:r>
     </w:p>
     <w:p>

</xml_diff>